<commit_message>
Added the GitHub Link...
</commit_message>
<xml_diff>
--- a/Multistreaming App - User Requirements Document.docx
+++ b/Multistreaming App - User Requirements Document.docx
@@ -959,6 +959,22 @@
     <w:p>
       <w:r>
         <w:t>This URD serves as the foundation for development. Any changes should be reviewed and approved by stakeholders. For technical implementation details, refer to React Native documentation and Firebase guides.</w:t>
+      </w:r>
+    </w:p>
+    <w:p>
+      <w:r>
+        <w:t xml:space="preserve">And the GitHub repository - </w:t>
+      </w:r>
+      <w:hyperlink r:id="rId5" w:history="1">
+        <w:r>
+          <w:rPr>
+            <w:rStyle w:val="Hyperlink"/>
+          </w:rPr>
+          <w:t>https://github.com/olatunji-weber/streamnova.git</w:t>
+        </w:r>
+      </w:hyperlink>
+      <w:r>
+        <w:t xml:space="preserve">  - can serve as our working reporitory to colaborate over.</w:t>
       </w:r>
     </w:p>
     <w:p/>
@@ -2916,6 +2932,7 @@
   <w:style w:type="character" w:default="1" w:styleId="DefaultParagraphFont">
     <w:name w:val="Default Paragraph Font"/>
     <w:uiPriority w:val="1"/>
+    <w:semiHidden/>
     <w:unhideWhenUsed/>
   </w:style>
   <w:style w:type="table" w:default="1" w:styleId="TableNormal">
@@ -3229,6 +3246,29 @@
       <w:spacing w:val="5"/>
     </w:rPr>
   </w:style>
+  <w:style w:type="character" w:styleId="Hyperlink">
+    <w:name w:val="Hyperlink"/>
+    <w:basedOn w:val="DefaultParagraphFont"/>
+    <w:uiPriority w:val="99"/>
+    <w:unhideWhenUsed/>
+    <w:rsid w:val="002A4574"/>
+    <w:rPr>
+      <w:color w:val="467886" w:themeColor="hyperlink"/>
+      <w:u w:val="single"/>
+    </w:rPr>
+  </w:style>
+  <w:style w:type="character" w:styleId="UnresolvedMention">
+    <w:name w:val="Unresolved Mention"/>
+    <w:basedOn w:val="DefaultParagraphFont"/>
+    <w:uiPriority w:val="99"/>
+    <w:semiHidden/>
+    <w:unhideWhenUsed/>
+    <w:rsid w:val="002A4574"/>
+    <w:rPr>
+      <w:color w:val="605E5C"/>
+      <w:shd w:val="clear" w:color="auto" w:fill="E1DFDD"/>
+    </w:rPr>
+  </w:style>
 </w:styles>
 </file>
 

</xml_diff>